<commit_message>
Ch23 review: Sakshi/Guard mechanics clarified, Meru scene (gallery rationale, boot flashback, power/no-off reasons, geography), Otto POV sensory limits, medic coda professionalized
</commit_message>
<xml_diff>
--- a/manuscript/chapter-23-the-proof.docx
+++ b/manuscript/chapter-23-the-proof.docx
@@ -8,6 +8,7 @@
       </w:pPr>
       <w:r>
         <w:rPr>
+          <w:b/>
           <w:color w:val="000000"/>
         </w:rPr>
         <w:t>Chapter 23: The Proof</w:t>
@@ -79,16 +80,12 @@
     </w:p>
     <w:p>
       <w:r>
-        <w:lastRenderedPageBreak/>
         <w:t>"Tell me what the notebook held."</w:t>
       </w:r>
     </w:p>
     <w:p>
       <w:r>
-        <w:t>He told her. He could, because every one of the four reported to him and to no one else — that was the rule that made him the body's will — and Baju had reported twice, by paper, by hand, in the weeks since the dead room. Sensor gaps. Lift holds. Door cycles that logged nothing. Weeks of them, each with a floor and an hour, pulled from maintenance records that no one but a maintenance hand ever read. Baju had been collecting the places where the city's instruments had been told to look away. He had believed</w:t>
-      </w:r>
-      <w:r>
-        <w:t xml:space="preserve"> the blind spots would make a shape, and the shape would have a center. His last report had said he was close. It had not said where.</w:t>
+        <w:t>He told her. He could, because every one of the four reported to him and to no one else — that was the rule that made him the body's will — and Baju had reported twice, by paper, by hand, in the weeks since the dead room. Sensor gaps. Lift holds. Door cycles that logged nothing. Weeks of them, each with a floor and an hour, pulled from maintenance records that no one but a maintenance hand ever read. Baju had been collecting the places where the city's instruments had been told to look away. He had believed the blind spots would make a shape, and the shape would have a center. His last report had said he was close. It had not said where.</w:t>
       </w:r>
     </w:p>
     <w:p>
@@ -118,10 +115,7 @@
     </w:p>
     <w:p>
       <w:r>
-        <w:t>"We are not going to send another person to crouch beside a blank and wait for it to happen in front of them. The hand knows that is how it was found. It will never let it be found that way twice." She crossed back to the table and put both palms flat on it. "Baju's method was right. The blanks are the trail. But he was reading them one panel at a time, by hand, in a tower that has a thousand panels. We need all of them. Every instrument in the city that has ever been told to look away, in one place, at onc</w:t>
-      </w:r>
-      <w:r>
-        <w:t>e. Then the shape is not something a man has to die to see. It is just a map."</w:t>
+        <w:t>"We are not going to send another person to crouch beside a blank and wait for it to happen in front of them. The hand knows that is how it was found. It will never let it be found that way twice." She crossed back to the table and put both palms flat on it. "Baju's method was right. The blanks are the trail. But he was reading them one panel at a time, by hand, in a tower that has a thousand panels. We need all of them. Every instrument in the city that has ever been told to look away, in one place, at once. Then the shape is not something a man has to die to see. It is just a map."</w:t>
       </w:r>
     </w:p>
     <w:p>
@@ -141,23 +135,7 @@
     </w:p>
     <w:p>
       <w:r>
-        <w:t>"There is an archive in Drona that nobody uses anymore, because the modern consoles cannot see it. The Sāk</w:t>
-      </w:r>
-      <w:r>
-        <w:t>ṣ</w:t>
-      </w:r>
-      <w:r>
-        <w:t>ī — the witness copies. In the first century, no record in this city was trusted on its own. Every one made a mirror of itself, written by different hands, kept somewhere else. When the consoles were rebuilt, the mirrors were left out of the new interface — not shut down, just no longer shown. A whole archive that still fills itself every day and that no one has opened in a generation except by the old filing paths. Anandi taught me to read it. It is how I found the two letters." She stopped. "I do not kno</w:t>
-      </w:r>
-      <w:r>
-        <w:t xml:space="preserve">w whether the </w:t>
-      </w:r>
-      <w:r>
-        <w:lastRenderedPageBreak/>
-        <w:t>mirrors keep a copy of what an instrument is told. I do not know whether they go deep enough or wide enough. Anandi taught me the path in, one file at a time — she does not hold the archive, she only knows the old way to knock on it. What I am asking for is the whole thing opened and searched, every house's instruments at once. No mentor can grant that. No elder can. In Drona there is one person whose word opens a sealed archive, and she is the same person who put me under a review code and to</w:t>
-      </w:r>
-      <w:r>
-        <w:t>ld me to use it without ever saying how far down it reaches. I think she knows exactly how far. I think she has been waiting for me to ask."</w:t>
+        <w:t>"There is an archive in Drona that nobody uses anymore, because the modern consoles cannot see it. The Sākṣī — the witness copies. In the first century, no record in this city was trusted on its own. Every one made a mirror of itself, written by different hands, kept somewhere else. When the consoles were rebuilt, the mirrors were left out of the new interface — not shut down, just no longer shown. A whole archive that still fills itself every day and that no one has opened in a generation except by the old filing paths. Anandi taught me to read it. It is how I found the two letters." She stopped. "I do not know whether the mirrors keep a copy of what an instrument is told. I do not know whether they go deep enough or wide enough. Anandi taught me the path in, one file at a time — she does not hold the archive, she only knows the old way to knock on it. What I am asking for is the whole thing opened and searched, every house's instruments at once. No mentor can grant that. No elder can. In Drona there is one person whose word opens a sealed archive, and she is the same person who put me under a review code and told me to use it without ever saying how far down it reaches. I think she knows exactly how far. I think she has been waiting for me to ask."</w:t>
       </w:r>
     </w:p>
     <w:p>
@@ -177,10 +155,7 @@
     </w:p>
     <w:p>
       <w:r>
-        <w:t>"Then tonight one does. Listen to me." She set the lantern down between them so that he had to look at her. "Whatever she gives us, she will not give for free. She will want it never to leave that room, and she will want the word of everyone who will act on it. I can give her mine. I cannot give her Ashoka's. If I go alone and bring it back to you, then you are bound by a promise you never made, to a Grandmaster you never faced, and the first time you have to decide whether to break it, you will be deciding</w:t>
-      </w:r>
-      <w:r>
-        <w:t xml:space="preserve"> about my word, not yours. That is no way to hold a secret that can get people killed. If Ashoka is going to be bound, Ashoka gives its own word, to her face."</w:t>
+        <w:t>"Then tonight one does. Listen to me." She set the lantern down between them so that he had to look at her. "Whatever she gives us, she will not give for free. She will want it never to leave that room, and she will want the word of everyone who will act on it. I can give her mine. I cannot give her Ashoka's. If I go alone and bring it back to you, then you are bound by a promise you never made, to a Grandmaster you never faced, and the first time you have to decide whether to break it, you will be deciding about my word, not yours. That is no way to hold a secret that can get people killed. If Ashoka is going to be bound, Ashoka gives its own word, to her face."</w:t>
       </w:r>
     </w:p>
     <w:p>
@@ -215,11 +190,7 @@
     </w:p>
     <w:p>
       <w:r>
-        <w:t xml:space="preserve">Elara had asked for the audience the only way she dared: a sealed paper note, carried by Anandi's own hand, with three lines on it. An officer of Ashoka is dead on Drona's ground. I </w:t>
-      </w:r>
-      <w:r>
-        <w:lastRenderedPageBreak/>
-        <w:t>request the witness archive, whole. Commander Rohan of Ashoka comes with me or I do not come. She had not expected an answer before morning. The answer had come in an hour.</w:t>
+        <w:t>Elara had asked for the audience the only way she dared: a sealed paper note, carried by Anandi's own hand, with three lines on it. An officer of Ashoka is dead on Drona's ground. I request the witness archive, whole. Commander Rohan of Ashoka comes with me or I do not come. She had not expected an answer before morning. The answer had come in an hour.</w:t>
       </w:r>
     </w:p>
     <w:p>
@@ -244,13 +215,7 @@
     </w:p>
     <w:p>
       <w:r>
-        <w:t>"The witness copies," Elara said. "All of them. Not read one file at a time through a legacy prompt, the way Anandi taught me. The whole archive, searched for one thing: every order ever given to an instrument in this city to look away. If the Sāk</w:t>
-      </w:r>
-      <w:r>
-        <w:t>ṣ</w:t>
-      </w:r>
-      <w:r>
-        <w:t>ī kept those orders, then the hand has been drawing its own map for months and leaving it in Drona's basement. If it did not, I have cost a commander of Ashoka a night, and I will apologize to him, and we will go back to paper."</w:t>
+        <w:t>"The witness copies," Elara said. "All of them. Not read one file at a time through a legacy prompt, the way Anandi taught me. The whole archive, searched for one thing: every order ever given to an instrument in this city to look away. If the Sākṣī kept those orders, then the hand has been drawing its own map for months and leaving it in Drona's basement. If it did not, I have cost a commander of Ashoka a night, and I will apologize to him, and we will go back to paper."</w:t>
       </w:r>
     </w:p>
     <w:p>
@@ -265,10 +230,7 @@
     </w:p>
     <w:p>
       <w:r>
-        <w:t>"We agreed that if it was ever asked, we would answer it," the Ancient One said. "We did not agree on how much." She unfolded her hands and looked first at Elara, then at Rohan. "Monitor Nathan. Commander Rohan. What I am about to tell you is not forbidden because it is dangerous to know. It is forbidden because it is dangerous to Drona. If it leaves this room in any form that can be traced to it, this house falls, and the balance between the four falls with it, and whatever is moving in the city now will h</w:t>
-      </w:r>
-      <w:r>
-        <w:t>ave the ruins to itself. You will use what I give you. You will never cite it. Anything you find by it, you will find again by some other road before you act on it. Are those terms understood."</w:t>
+        <w:t>"We agreed that if it was ever asked, we would answer it," the Ancient One said. "We did not agree on how much." She unfolded her hands and looked first at Elara, then at Rohan. "Monitor Nathan. Commander Rohan. What I am about to tell you is not forbidden because it is dangerous to know. It is forbidden because it is dangerous to Drona. If it leaves this room in any form that can be traced to it, this house falls, and the balance between the four falls with it, and whatever is moving in the city now will have the ruins to itself. You will use what I give you. You will never cite it. Anything you find by it, you will find again by some other road before you act on it. Are those terms understood."</w:t>
       </w:r>
     </w:p>
     <w:p>
@@ -278,7 +240,6 @@
     </w:p>
     <w:p>
       <w:r>
-        <w:lastRenderedPageBreak/>
         <w:t>The Ancient One did not look away from Rohan. "Commander, the question was for you. The monitor is mine. Whatever I tell her, she is bound to keep by the oath she already owes this house. You owe this house nothing. Your house will act on what you hear tonight, and your house will never be told where it came from, and if that is ever discovered, it will be Ashoka's commander who kept Drona's secret from Ashoka. Can you carry that."</w:t>
       </w:r>
     </w:p>
@@ -299,24 +260,12 @@
     </w:p>
     <w:p>
       <w:r>
-        <w:t>"Monitor Nathan already knows the Sāk</w:t>
-      </w:r>
-      <w:r>
-        <w:t>ṣ</w:t>
-      </w:r>
-      <w:r>
-        <w:t>ī," the Ancient One said, "and I expect, Commander, that she has told you what she knows. What Drona teaches its own about the mirrors is true and incomplete. Mirroring a record was Drona's habit before there was a Trinity — a scholar's caution, one copy kept apart from the hand that wrote the other. That part is true. What you were not taught is why that habit became an archive the size of a city, reaching into every house's instruments and not only our own. Drona did not do that to settle disputes. The d</w:t>
-      </w:r>
-      <w:r>
-        <w:t>isputes came later, and were a convenient thing to say. The archive was built as the price of something else, and the habit was the cover we hid it under." She looked at Sarvajña, and he took up the thread the way a man takes up a weight he has carried before.</w:t>
-      </w:r>
-    </w:p>
-    <w:p>
-      <w:r>
-        <w:t>"After the six days of fighting at the rebuilding," he said, "the house of Kubera came to the house of Drona with a commission. It wanted a guard. Not a company of men — men can be bribed, men can be seen, men take sides. It wanted a single instrument that could walk the city in a man's hand and be obeyed by every door, every ledger, every sensor, in every house, without any house being able to say it had been commanded. A guard that could not be seen. Kubera would write the authority — the founder-tier per</w:t>
-      </w:r>
-      <w:r>
-        <w:t>mission that every instrument in the city still honors, beneath every rule laid over it since. Drona would build the reader."</w:t>
+        <w:t>"Monitor Nathan already knows the Sākṣī," the Ancient One said, "and I expect, Commander, that she has told you what she knows. What Drona teaches its own about the mirrors is true and incomplete. Mirroring a record was Drona's habit before there was a Trinity — a scholar's caution, one copy kept apart from the hand that wrote the other. That part is true. What you were not taught is why that habit became an archive the size of a city, reaching into every house's instruments and not only our own. Drona did not do that to settle disputes. The disputes came later, and were a convenient thing to say. The archive was built as the price of something else, and the habit was the cover we hid it under." She looked at Sarvajña, and he took up the thread the way a man takes up a weight he has carried before.</w:t>
+      </w:r>
+    </w:p>
+    <w:p>
+      <w:r>
+        <w:t>"After the six days of fighting at the rebuilding," he said, "the house of Kubera came to the house of Drona with a commission. It wanted a guard. Not a company of men — men can be bribed, men can be seen, men take sides. It wanted a single instrument that could walk the city in a man's hand and be obeyed by every door, every ledger, every sensor, in every house, without any house being able to say it had been commanded. A guard that could not be seen. Kubera would write the authority — the founder-tier permission that every instrument in the city still honors, beneath every rule laid over it since. Drona would build the reader."</w:t>
       </w:r>
     </w:p>
     <w:p>
@@ -326,15 +275,11 @@
     </w:p>
     <w:p>
       <w:r>
-        <w:t>"The part that listens to the hand. Kubera understood ledgers. Drona understood instruments. Our engineers built a band that lies against the wrist and reads the nerves of the forearm — the small signals a body sends before it moves — and translates them into commands the city's instruments accept in whatever dialect each house uses for trust. It does not read a mind. It cannot. It reads a hand, a fraction of a second before the hand knows what it means to do." Sarvajña's fingers rested on the seven stones.</w:t>
-      </w:r>
-      <w:r>
-        <w:t xml:space="preserve"> "Kubera called the office it served the Obsidian Guard. It wore a black band. It was meant to be the one thing in the city that stood outside the four houses, so that none of them could ever again do what had been done in those six days."</w:t>
-      </w:r>
-    </w:p>
-    <w:p>
-      <w:r>
-        <w:lastRenderedPageBreak/>
+        <w:t>"The part that listens to the hand. Kubera understood ledgers. Drona understood instruments. Our engineers built a band that lies against the wrist and reads the nerves of the forearm — the small signals a body sends before it moves — and translates them into commands the city's instruments accept in whatever dialect each house uses for trust. It does not read a mind. It cannot. It reads a hand, a fraction of a second before the hand knows what it means to do." Sarvajña's fingers rested on the seven stones. "Kubera called the office it served the Obsidian Guard. It wore a black band. It was meant to be the one thing in the city that stood outside the four houses, so that none of them could ever again do what had been done in those six days."</w:t>
+      </w:r>
+    </w:p>
+    <w:p>
+      <w:r>
         <w:t>"OG," Rohan said quietly.</w:t>
       </w:r>
     </w:p>
@@ -350,10 +295,7 @@
     </w:p>
     <w:p>
       <w:r>
-        <w:t>"It existed for one generation," the Ancient One said. "And then the four houses saw what they had made. A guard that could not be seen was also a guard that could not be answered. Whoever wore it was accountable to no one — not even to the house that wrote its permission. So the four Grandmasters of that generation sealed it. The band was locked in a box of four parts, and the dialect it spoke was struck from every instrument's instruction, and the houses swore to each other that it was finished. Kubera sw</w:t>
-      </w:r>
-      <w:r>
-        <w:t>ore it kept the box only as a relic. Drona swore it had destroyed the plans for the reader, and had kept no record of the Guard's commands."</w:t>
+        <w:t>"It existed for one generation," the Ancient One said. "And then the four houses saw what they had made. A guard that could not be seen was also a guard that could not be answered. Whoever wore it was accountable to no one — not even to the house that wrote its permission. So the four Grandmasters of that generation sealed it. The band was locked in a box of four parts, and the dialect it spoke was struck from every instrument's instruction, and the houses swore to each other that it was finished. Kubera swore it kept the box only as a relic. Drona swore it had destroyed the plans for the reader, and had kept no record of the Guard's commands."</w:t>
       </w:r>
     </w:p>
     <w:p>
@@ -368,16 +310,7 @@
     </w:p>
     <w:p>
       <w:r>
-        <w:t>"We kept the plans," the Ancient One said. "That is one lie, and it is the smaller. The larger is this. When our engineers built the reader, they built it the way Drona built everything in that century: with a witness. Every command the Guard ever gave to any instrument in this city — every door it opened, every ledger it moved, every sensor it told to forget — the instrument obeyed, and wrote nothing. But the command itself was mirrored. Not the event. The order. Written in parallel, by a channel the Guard</w:t>
-      </w:r>
-      <w:r>
-        <w:t xml:space="preserve"> did not know existed, into the Sāk</w:t>
-      </w:r>
-      <w:r>
-        <w:t>ṣ</w:t>
-      </w:r>
-      <w:r>
-        <w:t>ī. For the one generation the Guard walked, Drona kept a ledger of everything it was ever told to do. And when the Guard was sealed, that channel was not. It has been listening to silence for a century."</w:t>
+        <w:t>"We kept the plans," the Ancient One said. "That is one lie, and it is the smaller. The larger is this. When our engineers built the reader, they built it the way Drona built everything in that century: with a witness. Every command the Guard ever gave to any instrument in this city — every door it opened, every ledger it moved, every sensor it told to forget — the instrument obeyed, and wrote nothing. But the command itself was mirrored. Not the event. The order. Written in parallel, by a channel the Guard did not know existed, into the Sākṣī. For the one generation the Guard walked, Drona kept a ledger of everything it was ever told to do. And when the Guard was sealed, that channel was not. It has been listening to silence for a century."</w:t>
       </w:r>
     </w:p>
     <w:p>
@@ -412,11 +345,7 @@
     </w:p>
     <w:p>
       <w:r>
-        <w:t xml:space="preserve">The oldest orders were all inside Kubera, dozens of them close together — someone practicing. Then they moved. Down into Drona's monitor tower. To a floor Elara knew. To a </w:t>
-      </w:r>
-      <w:r>
-        <w:lastRenderedPageBreak/>
-        <w:t>room on that floor that she had walked past a hundred times and never once thought about. Then out across the city, in lines: to a Chanakya conservatory on one night, at nine; to the archive wing on another; to transit platforms, service lifts, corridors. Each line was a walk. Each walk had been invisible to every eye in the city except this one, and this one had been shut in a basement and forgotten.</w:t>
+        <w:t>The oldest orders were all inside Kubera, dozens of them close together — someone practicing. Then they moved. Down into Drona's monitor tower. To a floor Elara knew. To a room on that floor that she had walked past a hundred times and never once thought about. Then out across the city, in lines: to a Chanakya conservatory on one night, at nine; to the archive wing on another; to transit platforms, service lifts, corridors. Each line was a walk. Each walk had been invisible to every eye in the city except this one, and this one had been shut in a basement and forgotten.</w:t>
       </w:r>
     </w:p>
     <w:p>
@@ -446,42 +375,17 @@
     </w:p>
     <w:p>
       <w:r>
-        <w:t>"Yes. And now you understand why no one may ever learn that this room exists." The Ancient One let the grey wall speak for a moment before she went on. "Think what you are looking at. Not the Guard's walks. Everything. For a hundred years, every time an instrument in Kubera, or Chanakya, or Ashoka was given an order, a copy of that order came here, to Drona, without their knowing. Drona swore to the other three that it did not have this. Drona has had it the whole time. If that were known tomorrow, no house</w:t>
-      </w:r>
-      <w:r>
-        <w:t xml:space="preserve"> in the city would ever trust a Drona instrument, a Drona record, or a Drona word again — and they would be right not to. The balance between the four houses rests on each of them believing the others are blind in the same places. We have not been blind. A house that has secretly watched the other three for a century is not a house. It is a tyranny that has not yet been noticed, and the day it is noticed, it falls." She folded her hands again. "You asked me, Monitor Nathan, how far down your review code rea</w:t>
-      </w:r>
-      <w:r>
-        <w:t>ches. This far. I did not tell you because I hoped you would not need it. You have cost me that hope. Use it."</w:t>
-      </w:r>
-    </w:p>
-    <w:p>
-      <w:r>
-        <w:t>"There is one more thing," Sarvajña said. "Because you will need it, and because the Guard's makers understood it better than any wearer ever has." He touched the stones. "The band reads a hand. Not a mind — a hand. It acts on what the hand is about to do, a heartbeat before the hand would do it. That makes it very fast, and very quiet, and it makes it something else, which the four Grandmasters who sealed it understood. It is only as calm as the hand that wears it. A careful man wearing the Guard is invisi</w:t>
-      </w:r>
-      <w:r>
-        <w:t xml:space="preserve">ble. A frightened man wearing the Guard is a weapon that fires itself." He looked at Rohan. "I cannot tell you what happened in that corridor. No one in this room was there. But I can tell you what the makers wrote down a century ago, because I have read it: the band acts on fear as readily as on intent, and faster, because fear is the louder signal. If your man came close enough to be </w:t>
-      </w:r>
-      <w:r>
-        <w:lastRenderedPageBreak/>
-        <w:t xml:space="preserve">truly seen by the hand itself, then the hand did not need to decide anything. It only needed to be afraid of him. Remember </w:t>
-      </w:r>
-      <w:r>
-        <w:t>that. You will not find this thing while it is careful. You will find it when it is afraid."</w:t>
-      </w:r>
-    </w:p>
-    <w:p>
-      <w:r>
-        <w:rPr>
-          <w:highlight w:val="yellow"/>
-        </w:rPr>
-        <w:t>Rohan said nothing. But</w:t>
-      </w:r>
-      <w:r>
-        <w:rPr>
-          <w:highlight w:val="yellow"/>
-        </w:rPr>
-        <w:t xml:space="preserve"> Elara saw his jaw set, and knew that he had already decided to make it afraid, and that Sarvajña had just told him the hand's own instrument would help.</w:t>
+        <w:t>"Yes. And now you understand why no one may ever learn that this room exists." The Ancient One let the grey wall speak for a moment before she went on. "Think what you are looking at. Not the Guard's walks. Everything. For a hundred years, every time an instrument in Kubera, or Chanakya, or Ashoka was given an order, a copy of that order came here, to Drona, without their knowing. Drona swore to the other three that it did not have this. Drona has had it the whole time. If that were known tomorrow, no house in the city would ever trust a Drona instrument, a Drona record, or a Drona word again — and they would be right not to. The balance between the four houses rests on each of them believing the others are blind in the same places. We have not been blind. A house that has secretly watched the other three for a century is not a house. It is a tyranny that has not yet been noticed, and the day it is noticed, it falls." She folded her hands again. "You asked me, Monitor Nathan, how far down your review code reaches. This far. I did not tell you because I hoped you would not need it. You have cost me that hope. Use it."</w:t>
+      </w:r>
+    </w:p>
+    <w:p>
+      <w:r>
+        <w:t>"There is one more thing," Sarvajña said. "Because you will need it, and because the Guard's makers understood it better than any wearer ever has." He touched the stones. "The band reads a hand. Not a mind — a hand. It acts on what the hand is about to do, a heartbeat before the hand would do it. That makes it very fast, and very quiet, and it makes it something else, which the four Grandmasters who sealed it understood. It is only as calm as the hand that wears it. A careful man wearing the Guard is invisible. A frightened man wearing the Guard is a weapon that fires itself." He looked at Rohan. "I cannot tell you what happened in that corridor. No one in this room was there. But I can tell you what the makers wrote down a century ago, because I have read it: the band acts on fear as readily as on intent, and faster, because fear is the louder signal. If your man came close enough to be truly seen by the hand itself, then the hand did not need to decide anything. It only needed to be afraid of him. Remember that. You will not find this thing while it is careful. You will find it when it is afraid."</w:t>
+      </w:r>
+    </w:p>
+    <w:p>
+      <w:r>
+        <w:t>Rohan said nothing. But Elara saw his jaw set, and understood what he had just been handed. A frightened hand made the band act — and every act the band made was written on this wall. Frighten the hand, and it would not only stumble. It would tell them, order by order, exactly where it was stumbling. The thing that made it invisible would be the thing that gave it away.</w:t>
       </w:r>
     </w:p>
     <w:p>
@@ -526,10 +430,7 @@
     </w:p>
     <w:p>
       <w:r>
-        <w:t>He stood in a public gallery above the lifted-water gardens, where the terraces stepped down toward the lights of the three cities below and the stewards' households sat behind their long windows, each with its panel glowing softly in a study or a hall. The two he wanted were in his sight. He had chosen this gallery because the bracelet's channels into a household panel were strongest within a few hundred paces, and because a man standing alone at a railing at this hour was a thing Meru had been built to ig</w:t>
-      </w:r>
-      <w:r>
-        <w:t>nore.</w:t>
+        <w:t>He stood in a public gallery above the lifted-water gardens, where the terraces stepped down toward the lights of the three cities below and the stewards' households sat behind their long windows, each with its panel glowing softly in a study or a hall. The two he wanted were in his sight. He had chosen this gallery for two reasons. The first he had learned by doing: the bracelet could reach a panel across the city if it had to, but the closer he stood, the less it had to borrow from the lines between, and the fewer places it had to ask to look away. A few hundred paces was close enough to need almost nothing. The second reason he had learned in his years as a Kubera officer. Meru's stewards were wealthy people who valued their privacy above almost everything, and the terraces had been built to give it to them — no one on Meru looked at anyone else, and no one asked a man standing alone at a railing what he was doing there. It was considered the worst kind of manners. Tonight it was cover.</w:t>
       </w:r>
     </w:p>
     <w:p>
@@ -544,13 +445,12 @@
     </w:p>
     <w:p>
       <w:r>
-        <w:t>That was the first thing. He had put his right hand on the railing to steady it and it would not steady. There was a fine tremor in it that had started in the corridor and had not stopped on the Skylark or the maglev or the long walk up through the terraces, and every time he looked at it, he saw a man's open eyes.</w:t>
-      </w:r>
-    </w:p>
-    <w:p>
-      <w:r>
-        <w:lastRenderedPageBreak/>
-        <w:t>He had not looked at the eyes for long. He had made himself turn away. But the turning away had not worked the way turning away usually worked, because the eyes had come with him — up the lift, across the dark between platforms, into this garden full of quiet water. They were here now. They were fixed on nothing. One boot half off.</w:t>
+        <w:t>He had put his right hand on the railing to steady it and it would not steady. There was a fine tremor in it that had started in the corridor and had not stopped on the Skylark or the maglev or the long walk up through the terraces, and every time his eyes fell on the black band at his wrist, he saw a man's open eyes.</w:t>
+      </w:r>
+    </w:p>
+    <w:p>
+      <w:r>
+        <w:t>He had not looked at the eyes for long. He had made himself turn away. But the turning away had not worked the way turning away usually worked, because the eyes had come with him — up the lift, across the dark between platforms, into this garden full of quiet water. He kept seeing the man exactly as he had left him: on his side, eyes open and fixed on nothing, one boot half off his foot. Of all of it, the boot was the detail he could not stop returning to. It was such a small, ordinary, undignified thing. It made the man a person.</w:t>
       </w:r>
     </w:p>
     <w:p>
@@ -565,10 +465,7 @@
     </w:p>
     <w:p>
       <w:r>
-        <w:t>That was the second thing, and it was worse. He had learned in the corridor what the band did with a frightened hand. He was standing in a garden on Meru with a frightened hand, and every nerve in his forearm was telling the band the same confused story — flinch, grip, get away — and the band was reading all of it, a heartbeat early, the way it read everything. If he let the fear run, it would act on something. He did not know what. A steward's pane. A garden pump. A lift. Someone else's hand on someone els</w:t>
-      </w:r>
-      <w:r>
-        <w:t>e's steel.</w:t>
+        <w:t>That was worse than the tremor itself. He had learned in the corridor what the band did with a frightened hand. He was standing in a garden on Meru with a frightened hand, and every nerve in his forearm was telling the band the same confused story — flinch, grip, get away — and the band was reading all of it, a heartbeat early, the way it read everything. If he let the fear run, it would act on something. He did not know what. A steward's pane. A garden pump. A lift. Someone else's hand on someone else's steel.</w:t>
       </w:r>
     </w:p>
     <w:p>
@@ -578,10 +475,7 @@
     </w:p>
     <w:p>
       <w:r>
-        <w:t>He breathed. He made his shoulders drop. He unclenched the hand on the railing one finger at a time, the way a man opens a hand that has been holding something too long, and he thought of nothing — not the councilmen, not the vote, not the eyes — only the hand, and the air around it, and the band growing cooler against his wrist as the nerves beneath it quieted. It took a long time. Meru's water ran. Somewhere below, a steward's household dimmed its lights for the night and did not know that a man in the ga</w:t>
-      </w:r>
-      <w:r>
-        <w:t>llery above had just spent all his strength making sure he did not kill them.</w:t>
+        <w:t>He breathed. He made his shoulders drop. He unclenched the hand on the railing one finger at a time, the way a man opens a hand that has been holding something too long, and he thought of nothing — not the councilmen, not the vote, not the eyes — only the hand, and the air around it, and the band growing cooler against his wrist as the nerves beneath it quieted. It took a long time. Meru's water ran. Somewhere below, a steward's household dimmed its lights for the night and did not know that a man in the gallery above had just spent all his strength making sure nothing in their house did anything it was not told to.</w:t>
       </w:r>
     </w:p>
     <w:p>
@@ -601,31 +495,32 @@
     </w:p>
     <w:p>
       <w:r>
-        <w:t xml:space="preserve">He thought about the man. He had never thought about any of them before — the clinics, the quotas, the faces on the other end of a line in a ledger — and now he could not stop, and the man in the corridor had become all of them. A weathered face. Climber's hands. A notebook soft with handling, which meant years of handling, which meant a life. The man had had a </w:t>
-      </w:r>
-      <w:r>
-        <w:lastRenderedPageBreak/>
-        <w:t>name. Daren did not know it and never would. He had put that name in a column and the column had said maintenance interval and that was the whole of the record, and Daren, who had spent his life believing that the record was the thing, understood for the first time that the record was the least of it.</w:t>
-      </w:r>
-    </w:p>
-    <w:p>
-      <w:r>
-        <w:t>He had wanted to be the force the city arranged itself around. The Grandmaster had promised him that, and the band had made it true. He had never once asked what a force did to the things it moved. A force did not get to choose. It moved what was in its path. He had been proud of that. He had called it being unseen.</w:t>
-      </w:r>
-    </w:p>
-    <w:p>
-      <w:r>
-        <w:t>He looked down at the band. It was cool now. It was waiting. It would do, tonight and tomorrow and for as long as he wore it, exactly what his hand told it, including the things his hand told it that he never heard. He could not take it off. He had tried. He could only be still — still enough, careful enough, calm enough, every hour of every day, that it never again heard anything he did not mean.</w:t>
-      </w:r>
-    </w:p>
-    <w:p>
-      <w:r>
-        <w:t>He did not think he was strong enough for that. He had never been asked to be.</w:t>
-      </w:r>
-    </w:p>
-    <w:p>
-      <w:r>
-        <w:t>Below him, on a terrace he could not see, a councilman's panel accepted a routine briefing note from his own staff and filed it for the morning. Above him, on a grey wall in a basement he had never heard of, two lines appeared with his hour on them, and someone read them.</w:t>
+        <w:t>He thought about the man. A weathered face. Climber's hands. A notebook worn soft from years of carrying, which meant years, which meant a life. The man had a name once. Daren did not know it and never would. The only record of his death said maintenance interval. Daren had spent his whole life believing the record was what mattered. Standing here, he understood that it was the least of it.</w:t>
+      </w:r>
+    </w:p>
+    <w:p>
+      <w:r>
+        <w:t>He had wanted to be the force the city arranged itself around. The Grandmaster had promised him that, and the band had made it true. He had never once asked what a force did to the things it moved. A force did not get to choose. It moved what was in its path. He had thought that was the whole point. He had called it power. He had not understood that it was only the absence of anyone able to tell him no.</w:t>
+      </w:r>
+    </w:p>
+    <w:p>
+      <w:r>
+        <w:t>He looked down at the band. It was cool now. It was waiting. It would do, tonight and tomorrow and for as long as he wore it, exactly what his hand told it, including the things his hand told it that he never heard.</w:t>
+      </w:r>
+    </w:p>
+    <w:p>
+      <w:r>
+        <w:t>He could not take it off. He had tried, in the corridor, with a dead man at his feet, and his own fingers had refused him. Not because the band held them. Because without it he was a man with no house, no name, and no door in the city that would open for him — a man the Grandmaster had emptied out and then filled with this. Take the band away and there was nothing underneath. He had made sure of that himself, one quiet correction at a time, until the instrument was the only part of him that still did anything.</w:t>
+      </w:r>
+    </w:p>
+    <w:p>
+      <w:r>
+        <w:t>So he could not take it off. He could only be still — still enough, careful enough, calm enough, every hour of every day, that it never again heard anything he did not mean.</w:t>
+      </w:r>
+    </w:p>
+    <w:p>
+      <w:r>
+        <w:t>Below him, on a terrace he could not see, a councilman's panel accepted a routine briefing note from his own staff and filed it for the morning. Further below, in a chamber beneath Drona's archive that he had never heard of, two lines appeared on a grey wall with his hour on them, and someone read them.</w:t>
       </w:r>
     </w:p>
     <w:p>
@@ -645,12 +540,12 @@
     </w:p>
     <w:p>
       <w:r>
-        <w:t>Otto knew that the way one knows things in dreams — completely, and without being able to say how. There was warm and there was cool. There was a pull in his arms that came and went, as if someone far away kept asking his muscles to lift something and then letting them rest. There was a sound, very faint, which might have been his own heart or might have been a machine pretending to be it. And there was the blue, everywhere, holding him the way water holds a man who has stopped swimming.</w:t>
-      </w:r>
-    </w:p>
-    <w:p>
-      <w:r>
-        <w:t>He had stopped swimming a long time ago. He remembered that much. There had been a ring of stones and a floor of fire and three people who needed the stones to stay up, and he had gone down into the stillness Master Chan had taught him, deeper than he had ever gone, to find the strength to hold them. He had found it. He had held them. And then the trial had ended and the others had gone out through the door, and Otto had turned to follow, and found that he could not find the way back up.</w:t>
+        <w:t>Otto knew that the way one knows things in dreams — completely, and without being able to say how. There was warm and there was cool. There was a pull in his arms that came and went, as if someone far away kept asking his muscles to lift something and then letting them rest. He did not know who was asking, or what the weight was. There was a sound, very faint and very steady, which might have been his own heart or might have been something else keeping time for it. And there was the blue. He could not have said whether he saw it or only knew it — light through closed eyes, perhaps, or the color his mind gave to the deep place Master Chan had taught him to go, the color of the breath at an old man's skin. It did not matter which. It was everywhere, and it held him the way water holds a man who has stopped swimming.</w:t>
+      </w:r>
+    </w:p>
+    <w:p>
+      <w:r>
+        <w:t>He had stopped swimming a long time ago. He remembered that much. There had been a ring of stones and a floor of fire and three people who needed the stones to stay up, and he had gone down into the stillness Master Chan had taught him, deeper than he had ever gone, to find the strength to hold them. He had found it. He had held them. And then the trial had ended and the others had gone out through the door, and Otto had tried to come back out of the stillness the way he always had — and it had not let him go.</w:t>
       </w:r>
     </w:p>
     <w:p>
@@ -660,7 +555,6 @@
     </w:p>
     <w:p>
       <w:r>
-        <w:lastRenderedPageBreak/>
         <w:t>He was not trapped. He was adapted. He had matched the room so perfectly that there was no longer any difference between him and the room, and a thing that is no different from the room cannot leave it.</w:t>
       </w:r>
     </w:p>
@@ -671,10 +565,7 @@
     </w:p>
     <w:p>
       <w:r>
-        <w:t>Blue on blue. He almost did not see it. Then its wings opened and closed, slowly, the way they had opened and closed on an old man's shoulder in a yard behind a shed, and Otto knew where he was before the yard finished forming around him: packed earth, the shed's leaning wall, the heat of a Miner Town afternoon that had been dead for years. Master Chan sat cross-legged in the dust with his back very straight and his hands open on his knees, and the butterfly settled on his shoulder, and he looked at Otto th</w:t>
-      </w:r>
-      <w:r>
-        <w:t>e way he had looked at him the day he said you picked me.</w:t>
+        <w:t>Blue on blue. He almost did not see it. Then its wings opened and closed, slowly, the way they had opened and closed on an old man's shoulder in a yard behind a shed, and Otto knew where he was before the yard finished forming around him: packed earth, the shed's leaning wall, the heat of a Miner Town afternoon that had been dead for years. Master Chan sat cross-legged in the dust with his back very straight and his hands open on his knees, and the butterfly settled on his shoulder, and he looked at Otto the way he had looked at him the day he said you picked me.</w:t>
       </w:r>
     </w:p>
     <w:p>
@@ -689,7 +580,7 @@
     </w:p>
     <w:p>
       <w:r>
-        <w:t>"I did. You were a loud boy. All fists. I taught you that the fist is the last thing, not the first, and that most fights are won by the man who can be still long enough to see where the other man is going to be." The old man's eyes were kind and not at all soft. "You learned it better than I did. I have been watching you hold those stones. I have never seen anyone go so deep."</w:t>
+        <w:t>"I did. You were a loud boy. All fists. I taught you that the fist is the last thing, not the first, and that most fights are won by the man who can be still long enough to see where the other man is going to be." The old man's eyes were kind, the way they had always been kind — the way a good teacher is kind, which has nothing to do with being gentle. "You learned it better than I did. I have been watching you hold those stones. I have never seen anyone go so deep."</w:t>
       </w:r>
     </w:p>
     <w:p>
@@ -714,10 +605,7 @@
     </w:p>
     <w:p>
       <w:r>
-        <w:t>"I told you to adapt," he said at last, "because the room was stronger than you, and a man who fights a stronger thing head-on breaks. That was true then. It is not true now." He leaned forward, and for the first time Otto saw that the old man was not calm. He was urgent. "Look at where you are, Otto. There is no room. There is no stronger thing. There is only you. You have adapted to yourself so completely that you have disappeared into it. You cannot match this. You cannot embrace it. You cannot channel i</w:t>
-      </w:r>
-      <w:r>
-        <w:t>t as your own — it is already your own. That is the whole of the trap."</w:t>
+        <w:t>"I told you to adapt," he said at last, "because the room was stronger than you, and a man who fights a stronger thing head-on breaks. That was true then. It is not true now." He leaned forward, and for the first time Otto saw that the old man was not calm. He was urgent. "Look at where you are, Otto. There is no room. There is no stronger thing. There is only you. You have adapted to yourself so completely that you have disappeared into it. You cannot match this. You cannot embrace it. You cannot channel it as your own — it is already your own. That is the whole of the trap."</w:t>
       </w:r>
     </w:p>
     <w:p>
@@ -727,11 +615,7 @@
     </w:p>
     <w:p>
       <w:r>
-        <w:t xml:space="preserve">"What I never taught you to do, because you never needed it." Master Chan's open hands closed, slowly, into fists on his knees. "You fight. Not the room. Yourself. The stillness you </w:t>
-      </w:r>
-      <w:r>
-        <w:lastRenderedPageBreak/>
-        <w:t>built is a wall, and you built it well, and now you are on the wrong side of it, and the only way through a wall you built yourself is to break it. Not adapt. Not align. Break. It will feel like dying. It will feel like betraying everything I taught you. Do it anyway."</w:t>
+        <w:t>"What I never taught you to do, because you never needed it." Master Chan's open hands closed, slowly, into fists on his knees. "You fight. Not the room. Yourself. The stillness you built is a wall, and you built it well, and now you are on the wrong side of it, and the only way through a wall you built yourself is to break it. Not adapt. Not align. Break. It will feel like dying. It will feel like betraying everything I taught you. Do it anyway."</w:t>
       </w:r>
     </w:p>
     <w:p>
@@ -766,10 +650,7 @@
     </w:p>
     <w:p>
       <w:r>
-        <w:t>There was nothing to fight against, and so he fought the nothing. He found the place where the stillness was smoothest, where there was no difference at all between him and the blue, and he threw himself at it — not his body, which he could not find, but whatever was left of him that could want. He wanted his hand. One hand. He did not know which. He did not know where it was. He wanted it the way he had wanted the stones to stay up, with everything, and the stillness did not move, because he had built it n</w:t>
-      </w:r>
-      <w:r>
-        <w:t>ot to.</w:t>
+        <w:t>There was nothing to fight against, and so he fought the nothing. He found the place where the stillness was smoothest, where there was no difference at all between him and the blue, and he threw himself at it — not his body, which he could not find, but whatever was left of him that could want. He wanted his hand. One hand. He did not know which. He did not know where it was. He wanted it the way he had wanted the stones to stay up, with everything, and the stillness did not move, because he had built it not to.</w:t>
       </w:r>
     </w:p>
     <w:p>
@@ -804,7 +685,6 @@
     </w:p>
     <w:p>
       <w:r>
-        <w:lastRenderedPageBreak/>
         <w:t>One finger. The first finger of the right hand. He did not try to feel it. He did not try to find it. He simply poured everything he had left into the single, stupid, animal demand that it bend — not the stillness bending, not the room, not the blue, him — and he held the demand the way he had once held a ring of stones over a floor of fire, past the point where anything in him said he could, and past that, and past that.</w:t>
       </w:r>
     </w:p>
@@ -865,7 +745,12 @@
     </w:p>
     <w:p>
       <w:r>
-        <w:t>She did not call for anyone yet. She stood with her palm against the glass and watched a boy who had been nowhere for three days fight his way back one finger at a time, and she found that she was saying his name, quietly, over and over, as if he might hear it.</w:t>
+        <w:t>She watched the finger curl a third time. Then she did what the office had trained her to do: she marked the time on the panel, noted the phase of the cycle, and keyed the night medic's alert for the room two levels down where three people had asked to be woken for anything.</w:t>
+      </w:r>
+    </w:p>
+    <w:p>
+      <w:r>
+        <w:t>Then she went back to the glass. She had sat with enough of the unconscious to know the order things came back in — a finger first, then the eyes, sometimes within the hour, sometimes not for days. There was no telling which this would be. But someone should be standing there if it was the hour, and there was no one else awake to do it.</w:t>
       </w:r>
     </w:p>
     <w:sectPr>

</xml_diff>